<commit_message>
feat(meeting-team): enhance AI prompt for detailed summary & timeline and include meeting_summary in Word export
</commit_message>
<xml_diff>
--- a/dashboard/public/templates/bien_ban_hop_template.docx
+++ b/dashboard/public/templates/bien_ban_hop_template.docx
@@ -22,7 +22,7 @@
           <w:szCs w:val="24"/>
         </w:rPr>
         <w:drawing>
-          <wp:anchor distT="0" distB="0" distL="114300" distR="114300" simplePos="0" relativeHeight="251658240" behindDoc="1" locked="0" layoutInCell="1" allowOverlap="1" wp14:anchorId="68867B7E" wp14:editId="0AC304B5">
+          <wp:anchor distT="0" distB="0" distL="114300" distR="114300" simplePos="0" relativeHeight="251658240" behindDoc="1" locked="0" layoutInCell="1" allowOverlap="1" wp14:anchorId="68867B7E" wp14:editId="72FB7626">
             <wp:simplePos x="0" y="0"/>
             <wp:positionH relativeFrom="page">
               <wp:align>right</wp:align>
@@ -168,96 +168,11 @@
         <w:rPr>
           <w:rFonts w:ascii="Myriad Pro" w:hAnsi="Myriad Pro"/>
           <w:b/>
-          <w:i/>
-          <w:iCs/>
           <w:color w:val="002060"/>
         </w:rPr>
       </w:pPr>
       <w:r>
-        <w:rPr>
-          <w:b/>
-          <w:bCs/>
-          <w:color w:val="2F5496" w:themeColor="accent1" w:themeShade="BF"/>
-        </w:rPr>
-        <w:t>Số</w:t>
-      </w:r>
-      <w:proofErr w:type="gramStart"/>
-      <w:r>
-        <w:rPr>
-          <w:b/>
-          <w:bCs/>
-          <w:color w:val="2F5496" w:themeColor="accent1" w:themeShade="BF"/>
-        </w:rPr>
-        <w:t>:  {</w:t>
-      </w:r>
-      <w:proofErr w:type="gramEnd"/>
-      <w:r>
-        <w:rPr>
-          <w:b/>
-          <w:bCs/>
-          <w:color w:val="2F5496" w:themeColor="accent1" w:themeShade="BF"/>
-        </w:rPr>
-        <w:t>doc_</w:t>
-      </w:r>
-      <w:proofErr w:type="gramStart"/>
-      <w:r>
-        <w:rPr>
-          <w:b/>
-          <w:bCs/>
-          <w:color w:val="2F5496" w:themeColor="accent1" w:themeShade="BF"/>
-        </w:rPr>
-        <w:t>number</w:t>
-      </w:r>
-      <w:r>
-        <w:rPr>
-          <w:b/>
-          <w:bCs/>
-          <w:i/>
-          <w:iCs/>
-          <w:color w:val="2F5496" w:themeColor="accent1" w:themeShade="BF"/>
-        </w:rPr>
-        <w:t>}</w:t>
-      </w:r>
-      <w:r>
-        <w:rPr>
-          <w:i/>
-          <w:iCs/>
-          <w:color w:val="2F5496" w:themeColor="accent1" w:themeShade="BF"/>
-        </w:rPr>
-        <w:t xml:space="preserve">   </w:t>
-      </w:r>
-      <w:proofErr w:type="gramEnd"/>
-      <w:r>
-        <w:rPr>
-          <w:i/>
-          <w:iCs/>
-          <w:color w:val="2F5496" w:themeColor="accent1" w:themeShade="BF"/>
-        </w:rPr>
-        <w:t xml:space="preserve">                                  </w:t>
-      </w:r>
-      <w:proofErr w:type="gramStart"/>
-      <w:r>
-        <w:rPr>
-          <w:i/>
-          <w:iCs/>
-          <w:color w:val="2F5496" w:themeColor="accent1" w:themeShade="BF"/>
-        </w:rPr>
-        <w:t xml:space="preserve">   </w:t>
-      </w:r>
-      <w:r>
-        <w:rPr>
-          <w:i/>
-          <w:iCs/>
-        </w:rPr>
-        <w:t>{</w:t>
-      </w:r>
-      <w:proofErr w:type="gramEnd"/>
-      <w:r>
-        <w:rPr>
-          <w:i/>
-          <w:iCs/>
-        </w:rPr>
-        <w:t>location_date}</w:t>
+        <w:t>Số:  {doc_number}                                        {location_date}</w:t>
       </w:r>
     </w:p>
     <w:p>
@@ -312,14 +227,14 @@
         <w:rPr>
           <w:rFonts w:ascii="Myriad Pro" w:hAnsi="Myriad Pro"/>
           <w:b/>
-          <w:color w:val="2F5496" w:themeColor="accent1" w:themeShade="BF"/>
+          <w:color w:val="002060"/>
         </w:rPr>
       </w:pPr>
       <w:r>
         <w:rPr>
           <w:rFonts w:ascii="Myriad Pro" w:hAnsi="Myriad Pro"/>
           <w:b/>
-          <w:color w:val="2F5496" w:themeColor="accent1" w:themeShade="BF"/>
+          <w:color w:val="002060"/>
         </w:rPr>
         <w:t>THÀNH PHẦN THAM DỰ</w:t>
       </w:r>
@@ -359,14 +274,14 @@
               <w:jc w:val="both"/>
               <w:rPr>
                 <w:rFonts w:ascii="Myriad Pro" w:hAnsi="Myriad Pro"/>
-                <w:color w:val="2F5496" w:themeColor="accent1" w:themeShade="BF"/>
+                <w:color w:val="002060"/>
               </w:rPr>
             </w:pPr>
             <w:proofErr w:type="spellStart"/>
             <w:r>
               <w:rPr>
                 <w:rFonts w:ascii="Myriad Pro" w:hAnsi="Myriad Pro"/>
-                <w:color w:val="2F5496" w:themeColor="accent1" w:themeShade="BF"/>
+                <w:color w:val="002060"/>
               </w:rPr>
               <w:t>Chủ</w:t>
             </w:r>
@@ -374,7 +289,7 @@
             <w:r>
               <w:rPr>
                 <w:rFonts w:ascii="Myriad Pro" w:hAnsi="Myriad Pro"/>
-                <w:color w:val="2F5496" w:themeColor="accent1" w:themeShade="BF"/>
+                <w:color w:val="002060"/>
               </w:rPr>
               <w:t xml:space="preserve"> </w:t>
             </w:r>
@@ -382,7 +297,7 @@
             <w:r>
               <w:rPr>
                 <w:rFonts w:ascii="Myriad Pro" w:hAnsi="Myriad Pro"/>
-                <w:color w:val="2F5496" w:themeColor="accent1" w:themeShade="BF"/>
+                <w:color w:val="002060"/>
               </w:rPr>
               <w:t>trì</w:t>
             </w:r>
@@ -390,7 +305,7 @@
             <w:r>
               <w:rPr>
                 <w:rFonts w:ascii="Myriad Pro" w:hAnsi="Myriad Pro"/>
-                <w:color w:val="2F5496" w:themeColor="accent1" w:themeShade="BF"/>
+                <w:color w:val="002060"/>
               </w:rPr>
               <w:t>:</w:t>
             </w:r>
@@ -401,15 +316,7 @@
             <w:tcW w:w="3827" w:type="dxa"/>
           </w:tcPr>
           <w:p>
-            <w:pPr>
-              <w:rPr>
-                <w:color w:val="2F5496" w:themeColor="accent1" w:themeShade="BF"/>
-              </w:rPr>
-            </w:pPr>
             <w:r>
-              <w:rPr>
-                <w:color w:val="2F5496" w:themeColor="accent1" w:themeShade="BF"/>
-              </w:rPr>
               <w:t>{chair_name}</w:t>
             </w:r>
           </w:p>
@@ -419,15 +326,7 @@
             <w:tcW w:w="3686" w:type="dxa"/>
           </w:tcPr>
           <w:p>
-            <w:pPr>
-              <w:rPr>
-                <w:color w:val="2F5496" w:themeColor="accent1" w:themeShade="BF"/>
-              </w:rPr>
-            </w:pPr>
             <w:r>
-              <w:rPr>
-                <w:color w:val="2F5496" w:themeColor="accent1" w:themeShade="BF"/>
-              </w:rPr>
               <w:t>{chair_role}</w:t>
             </w:r>
           </w:p>
@@ -448,13 +347,13 @@
               <w:jc w:val="both"/>
               <w:rPr>
                 <w:rFonts w:ascii="Myriad Pro" w:hAnsi="Myriad Pro"/>
-                <w:color w:val="2F5496" w:themeColor="accent1" w:themeShade="BF"/>
+                <w:color w:val="002060"/>
               </w:rPr>
             </w:pPr>
             <w:r>
               <w:rPr>
                 <w:rFonts w:ascii="Myriad Pro" w:hAnsi="Myriad Pro"/>
-                <w:color w:val="2F5496" w:themeColor="accent1" w:themeShade="BF"/>
+                <w:color w:val="002060"/>
               </w:rPr>
               <w:t xml:space="preserve">Thư </w:t>
             </w:r>
@@ -462,7 +361,7 @@
             <w:r>
               <w:rPr>
                 <w:rFonts w:ascii="Myriad Pro" w:hAnsi="Myriad Pro"/>
-                <w:color w:val="2F5496" w:themeColor="accent1" w:themeShade="BF"/>
+                <w:color w:val="002060"/>
               </w:rPr>
               <w:t>ký</w:t>
             </w:r>
@@ -470,7 +369,7 @@
             <w:r>
               <w:rPr>
                 <w:rFonts w:ascii="Myriad Pro" w:hAnsi="Myriad Pro"/>
-                <w:color w:val="2F5496" w:themeColor="accent1" w:themeShade="BF"/>
+                <w:color w:val="002060"/>
               </w:rPr>
               <w:t>:</w:t>
             </w:r>
@@ -481,15 +380,7 @@
             <w:tcW w:w="3827" w:type="dxa"/>
           </w:tcPr>
           <w:p>
-            <w:pPr>
-              <w:rPr>
-                <w:color w:val="2F5496" w:themeColor="accent1" w:themeShade="BF"/>
-              </w:rPr>
-            </w:pPr>
             <w:r>
-              <w:rPr>
-                <w:color w:val="2F5496" w:themeColor="accent1" w:themeShade="BF"/>
-              </w:rPr>
               <w:t>{sec_name}</w:t>
             </w:r>
           </w:p>
@@ -499,15 +390,7 @@
             <w:tcW w:w="3686" w:type="dxa"/>
           </w:tcPr>
           <w:p>
-            <w:pPr>
-              <w:rPr>
-                <w:color w:val="2F5496" w:themeColor="accent1" w:themeShade="BF"/>
-              </w:rPr>
-            </w:pPr>
             <w:r>
-              <w:rPr>
-                <w:color w:val="2F5496" w:themeColor="accent1" w:themeShade="BF"/>
-              </w:rPr>
               <w:t>{sec_role}</w:t>
             </w:r>
           </w:p>
@@ -522,15 +405,7 @@
             <w:tcW w:w="1701" w:type="dxa"/>
           </w:tcPr>
           <w:p>
-            <w:pPr>
-              <w:rPr>
-                <w:color w:val="2F5496" w:themeColor="accent1" w:themeShade="BF"/>
-              </w:rPr>
-            </w:pPr>
             <w:r>
-              <w:rPr>
-                <w:color w:val="2F5496" w:themeColor="accent1" w:themeShade="BF"/>
-              </w:rPr>
               <w:t>Thành viên:</w:t>
             </w:r>
           </w:p>
@@ -540,15 +415,7 @@
             <w:tcW w:w="3827" w:type="dxa"/>
           </w:tcPr>
           <w:p>
-            <w:pPr>
-              <w:rPr>
-                <w:color w:val="2F5496" w:themeColor="accent1" w:themeShade="BF"/>
-              </w:rPr>
-            </w:pPr>
             <w:r>
-              <w:rPr>
-                <w:color w:val="2F5496" w:themeColor="accent1" w:themeShade="BF"/>
-              </w:rPr>
               <w:t>{attendees_text}</w:t>
             </w:r>
           </w:p>
@@ -558,11 +425,7 @@
             <w:tcW w:w="3686" w:type="dxa"/>
           </w:tcPr>
           <w:p>
-            <w:pPr>
-              <w:rPr>
-                <w:color w:val="2F5496" w:themeColor="accent1" w:themeShade="BF"/>
-              </w:rPr>
-            </w:pPr>
+            <w:r/>
           </w:p>
         </w:tc>
       </w:tr>
@@ -581,14 +444,14 @@
         <w:rPr>
           <w:rFonts w:ascii="Myriad Pro" w:hAnsi="Myriad Pro"/>
           <w:b/>
-          <w:color w:val="2F5496" w:themeColor="accent1" w:themeShade="BF"/>
+          <w:color w:val="002060"/>
         </w:rPr>
       </w:pPr>
       <w:r>
         <w:rPr>
           <w:rFonts w:ascii="Myriad Pro" w:hAnsi="Myriad Pro"/>
           <w:b/>
-          <w:color w:val="2F5496" w:themeColor="accent1" w:themeShade="BF"/>
+          <w:color w:val="002060"/>
         </w:rPr>
         <w:t>NỘI DUNG CUỘC HỌP:</w:t>
       </w:r>
@@ -609,671 +472,11 @@
           <w:lang w:val="es-ES"/>
         </w:rPr>
       </w:pPr>
-      <w:proofErr w:type="spellStart"/>
-      <w:r>
-        <w:rPr>
-          <w:rFonts w:ascii="Myriad Pro" w:hAnsi="Myriad Pro"/>
-          <w:color w:val="002060"/>
-          <w:lang w:val="es-ES"/>
-        </w:rPr>
-        <w:t>Sau</w:t>
-      </w:r>
-      <w:proofErr w:type="spellEnd"/>
-      <w:r>
-        <w:rPr>
-          <w:rFonts w:ascii="Myriad Pro" w:hAnsi="Myriad Pro"/>
-          <w:color w:val="002060"/>
-          <w:lang w:val="es-ES"/>
-        </w:rPr>
-        <w:t xml:space="preserve"> </w:t>
-      </w:r>
-      <w:proofErr w:type="spellStart"/>
-      <w:r>
-        <w:rPr>
-          <w:rFonts w:ascii="Myriad Pro" w:hAnsi="Myriad Pro"/>
-          <w:color w:val="002060"/>
-          <w:lang w:val="es-ES"/>
-        </w:rPr>
-        <w:t>khi</w:t>
-      </w:r>
-      <w:proofErr w:type="spellEnd"/>
-      <w:r>
-        <w:rPr>
-          <w:rFonts w:ascii="Myriad Pro" w:hAnsi="Myriad Pro"/>
-          <w:color w:val="002060"/>
-          <w:lang w:val="es-ES"/>
-        </w:rPr>
-        <w:t xml:space="preserve"> </w:t>
-      </w:r>
-      <w:proofErr w:type="spellStart"/>
-      <w:r>
-        <w:rPr>
-          <w:rFonts w:ascii="Myriad Pro" w:hAnsi="Myriad Pro"/>
-          <w:color w:val="002060"/>
-          <w:lang w:val="es-ES"/>
-        </w:rPr>
-        <w:t>lắng</w:t>
-      </w:r>
-      <w:proofErr w:type="spellEnd"/>
-      <w:r>
-        <w:rPr>
-          <w:rFonts w:ascii="Myriad Pro" w:hAnsi="Myriad Pro"/>
-          <w:color w:val="002060"/>
-          <w:lang w:val="es-ES"/>
-        </w:rPr>
-        <w:t xml:space="preserve"> </w:t>
-      </w:r>
-      <w:proofErr w:type="spellStart"/>
-      <w:r>
-        <w:rPr>
-          <w:rFonts w:ascii="Myriad Pro" w:hAnsi="Myriad Pro"/>
-          <w:color w:val="002060"/>
-          <w:lang w:val="es-ES"/>
-        </w:rPr>
-        <w:t>nghe</w:t>
-      </w:r>
-      <w:proofErr w:type="spellEnd"/>
-      <w:r>
-        <w:rPr>
-          <w:rFonts w:ascii="Myriad Pro" w:hAnsi="Myriad Pro"/>
-          <w:color w:val="002060"/>
-          <w:lang w:val="es-ES"/>
-        </w:rPr>
-        <w:t xml:space="preserve"> </w:t>
-      </w:r>
-      <w:proofErr w:type="spellStart"/>
-      <w:r>
-        <w:rPr>
-          <w:rFonts w:ascii="Myriad Pro" w:hAnsi="Myriad Pro"/>
-          <w:color w:val="002060"/>
-          <w:lang w:val="es-ES"/>
-        </w:rPr>
-        <w:t>các</w:t>
-      </w:r>
-      <w:proofErr w:type="spellEnd"/>
-      <w:r>
-        <w:rPr>
-          <w:rFonts w:ascii="Myriad Pro" w:hAnsi="Myriad Pro"/>
-          <w:color w:val="002060"/>
-          <w:lang w:val="es-ES"/>
-        </w:rPr>
-        <w:t xml:space="preserve"> </w:t>
-      </w:r>
-      <w:proofErr w:type="spellStart"/>
-      <w:r>
-        <w:rPr>
-          <w:rFonts w:ascii="Myriad Pro" w:hAnsi="Myriad Pro"/>
-          <w:color w:val="002060"/>
-          <w:lang w:val="es-ES"/>
-        </w:rPr>
-        <w:t>Phó</w:t>
-      </w:r>
-      <w:proofErr w:type="spellEnd"/>
-      <w:r>
-        <w:rPr>
-          <w:rFonts w:ascii="Myriad Pro" w:hAnsi="Myriad Pro"/>
-          <w:color w:val="002060"/>
-          <w:lang w:val="es-ES"/>
-        </w:rPr>
-        <w:t xml:space="preserve"> </w:t>
-      </w:r>
-      <w:proofErr w:type="spellStart"/>
-      <w:r>
-        <w:rPr>
-          <w:rFonts w:ascii="Myriad Pro" w:hAnsi="Myriad Pro"/>
-          <w:color w:val="002060"/>
-          <w:lang w:val="es-ES"/>
-        </w:rPr>
-        <w:t>giám</w:t>
-      </w:r>
-      <w:proofErr w:type="spellEnd"/>
-      <w:r>
-        <w:rPr>
-          <w:rFonts w:ascii="Myriad Pro" w:hAnsi="Myriad Pro"/>
-          <w:color w:val="002060"/>
-          <w:lang w:val="es-ES"/>
-        </w:rPr>
-        <w:t xml:space="preserve"> </w:t>
-      </w:r>
-      <w:proofErr w:type="spellStart"/>
-      <w:r>
-        <w:rPr>
-          <w:rFonts w:ascii="Myriad Pro" w:hAnsi="Myriad Pro"/>
-          <w:color w:val="002060"/>
-          <w:lang w:val="es-ES"/>
-        </w:rPr>
-        <w:t>đốc</w:t>
-      </w:r>
-      <w:proofErr w:type="spellEnd"/>
-      <w:r>
-        <w:rPr>
-          <w:rFonts w:ascii="Myriad Pro" w:hAnsi="Myriad Pro"/>
-          <w:color w:val="002060"/>
-          <w:lang w:val="es-ES"/>
-        </w:rPr>
-        <w:t xml:space="preserve"> </w:t>
-      </w:r>
-      <w:proofErr w:type="spellStart"/>
-      <w:r>
-        <w:rPr>
-          <w:rFonts w:ascii="Myriad Pro" w:hAnsi="Myriad Pro"/>
-          <w:color w:val="002060"/>
-          <w:lang w:val="es-ES"/>
-        </w:rPr>
-        <w:t>và</w:t>
-      </w:r>
-      <w:proofErr w:type="spellEnd"/>
-      <w:r>
-        <w:rPr>
-          <w:rFonts w:ascii="Myriad Pro" w:hAnsi="Myriad Pro"/>
-          <w:color w:val="002060"/>
-          <w:lang w:val="es-ES"/>
-        </w:rPr>
-        <w:t xml:space="preserve"> </w:t>
-      </w:r>
-      <w:proofErr w:type="spellStart"/>
-      <w:r>
-        <w:rPr>
-          <w:rFonts w:ascii="Myriad Pro" w:hAnsi="Myriad Pro"/>
-          <w:color w:val="002060"/>
-          <w:lang w:val="es-ES"/>
-        </w:rPr>
-        <w:t>trưởng</w:t>
-      </w:r>
-      <w:proofErr w:type="spellEnd"/>
-      <w:r>
-        <w:rPr>
-          <w:rFonts w:ascii="Myriad Pro" w:hAnsi="Myriad Pro"/>
-          <w:color w:val="002060"/>
-          <w:lang w:val="es-ES"/>
-        </w:rPr>
-        <w:t xml:space="preserve"> </w:t>
-      </w:r>
-      <w:proofErr w:type="spellStart"/>
-      <w:r>
-        <w:rPr>
-          <w:rFonts w:ascii="Myriad Pro" w:hAnsi="Myriad Pro"/>
-          <w:color w:val="002060"/>
-          <w:lang w:val="es-ES"/>
-        </w:rPr>
-        <w:t>bộ</w:t>
-      </w:r>
-      <w:proofErr w:type="spellEnd"/>
-      <w:r>
-        <w:rPr>
-          <w:rFonts w:ascii="Myriad Pro" w:hAnsi="Myriad Pro"/>
-          <w:color w:val="002060"/>
-          <w:lang w:val="es-ES"/>
-        </w:rPr>
-        <w:t xml:space="preserve"> </w:t>
-      </w:r>
-      <w:proofErr w:type="spellStart"/>
-      <w:r>
-        <w:rPr>
-          <w:rFonts w:ascii="Myriad Pro" w:hAnsi="Myriad Pro"/>
-          <w:color w:val="002060"/>
-          <w:lang w:val="es-ES"/>
-        </w:rPr>
-        <w:t>phận</w:t>
-      </w:r>
-      <w:proofErr w:type="spellEnd"/>
-      <w:r>
-        <w:rPr>
-          <w:rFonts w:ascii="Myriad Pro" w:hAnsi="Myriad Pro"/>
-          <w:color w:val="002060"/>
-          <w:lang w:val="es-ES"/>
-        </w:rPr>
-        <w:t xml:space="preserve"> </w:t>
-      </w:r>
-      <w:proofErr w:type="spellStart"/>
-      <w:r>
-        <w:rPr>
-          <w:rFonts w:ascii="Myriad Pro" w:hAnsi="Myriad Pro"/>
-          <w:color w:val="002060"/>
-          <w:lang w:val="es-ES"/>
-        </w:rPr>
-        <w:t>báo</w:t>
-      </w:r>
-      <w:proofErr w:type="spellEnd"/>
-      <w:r>
-        <w:rPr>
-          <w:rFonts w:ascii="Myriad Pro" w:hAnsi="Myriad Pro"/>
-          <w:color w:val="002060"/>
-          <w:lang w:val="es-ES"/>
-        </w:rPr>
-        <w:t xml:space="preserve"> </w:t>
-      </w:r>
-      <w:proofErr w:type="spellStart"/>
-      <w:r>
-        <w:rPr>
-          <w:rFonts w:ascii="Myriad Pro" w:hAnsi="Myriad Pro"/>
-          <w:color w:val="002060"/>
-          <w:lang w:val="es-ES"/>
-        </w:rPr>
-        <w:t>cáo</w:t>
-      </w:r>
-      <w:proofErr w:type="spellEnd"/>
-      <w:r>
-        <w:rPr>
-          <w:rFonts w:ascii="Myriad Pro" w:hAnsi="Myriad Pro"/>
-          <w:color w:val="002060"/>
-          <w:lang w:val="es-ES"/>
-        </w:rPr>
-        <w:t xml:space="preserve"> </w:t>
-      </w:r>
-      <w:proofErr w:type="spellStart"/>
-      <w:r>
-        <w:rPr>
-          <w:rFonts w:ascii="Myriad Pro" w:hAnsi="Myriad Pro"/>
-          <w:color w:val="002060"/>
-          <w:lang w:val="es-ES"/>
-        </w:rPr>
-        <w:t>tình</w:t>
-      </w:r>
-      <w:proofErr w:type="spellEnd"/>
-      <w:r>
-        <w:rPr>
-          <w:rFonts w:ascii="Myriad Pro" w:hAnsi="Myriad Pro"/>
-          <w:color w:val="002060"/>
-          <w:lang w:val="es-ES"/>
-        </w:rPr>
-        <w:t xml:space="preserve"> </w:t>
-      </w:r>
-      <w:proofErr w:type="spellStart"/>
-      <w:r>
-        <w:rPr>
-          <w:rFonts w:ascii="Myriad Pro" w:hAnsi="Myriad Pro"/>
-          <w:color w:val="002060"/>
-          <w:lang w:val="es-ES"/>
-        </w:rPr>
-        <w:t>hình</w:t>
-      </w:r>
-      <w:proofErr w:type="spellEnd"/>
-      <w:r>
-        <w:rPr>
-          <w:rFonts w:ascii="Myriad Pro" w:hAnsi="Myriad Pro"/>
-          <w:color w:val="002060"/>
-          <w:lang w:val="es-ES"/>
-        </w:rPr>
-        <w:t xml:space="preserve"> </w:t>
-      </w:r>
-      <w:proofErr w:type="spellStart"/>
-      <w:r>
-        <w:rPr>
-          <w:rFonts w:ascii="Myriad Pro" w:hAnsi="Myriad Pro"/>
-          <w:color w:val="002060"/>
-          <w:lang w:val="es-ES"/>
-        </w:rPr>
-        <w:t>thực</w:t>
-      </w:r>
-      <w:proofErr w:type="spellEnd"/>
-      <w:r>
-        <w:rPr>
-          <w:rFonts w:ascii="Myriad Pro" w:hAnsi="Myriad Pro"/>
-          <w:color w:val="002060"/>
-          <w:lang w:val="es-ES"/>
-        </w:rPr>
-        <w:t xml:space="preserve"> </w:t>
-      </w:r>
-      <w:proofErr w:type="spellStart"/>
-      <w:r>
-        <w:rPr>
-          <w:rFonts w:ascii="Myriad Pro" w:hAnsi="Myriad Pro"/>
-          <w:color w:val="002060"/>
-          <w:lang w:val="es-ES"/>
-        </w:rPr>
-        <w:t>hiện</w:t>
-      </w:r>
-      <w:proofErr w:type="spellEnd"/>
-      <w:r>
-        <w:rPr>
-          <w:rFonts w:ascii="Myriad Pro" w:hAnsi="Myriad Pro"/>
-          <w:color w:val="002060"/>
-          <w:lang w:val="es-ES"/>
-        </w:rPr>
-        <w:t xml:space="preserve"> </w:t>
-      </w:r>
-      <w:proofErr w:type="spellStart"/>
-      <w:r>
-        <w:rPr>
-          <w:rFonts w:ascii="Myriad Pro" w:hAnsi="Myriad Pro"/>
-          <w:color w:val="002060"/>
-          <w:lang w:val="es-ES"/>
-        </w:rPr>
-        <w:t>triển</w:t>
-      </w:r>
-      <w:proofErr w:type="spellEnd"/>
-      <w:r>
-        <w:rPr>
-          <w:rFonts w:ascii="Myriad Pro" w:hAnsi="Myriad Pro"/>
-          <w:color w:val="002060"/>
-          <w:lang w:val="es-ES"/>
-        </w:rPr>
-        <w:t xml:space="preserve"> </w:t>
-      </w:r>
-      <w:proofErr w:type="spellStart"/>
-      <w:r>
-        <w:rPr>
-          <w:rFonts w:ascii="Myriad Pro" w:hAnsi="Myriad Pro"/>
-          <w:color w:val="002060"/>
-          <w:lang w:val="es-ES"/>
-        </w:rPr>
-        <w:t>khai</w:t>
-      </w:r>
-      <w:proofErr w:type="spellEnd"/>
-      <w:r>
-        <w:rPr>
-          <w:rFonts w:ascii="Myriad Pro" w:hAnsi="Myriad Pro"/>
-          <w:color w:val="002060"/>
-          <w:lang w:val="es-ES"/>
-        </w:rPr>
-        <w:t xml:space="preserve"> </w:t>
-      </w:r>
-      <w:proofErr w:type="spellStart"/>
-      <w:r>
-        <w:rPr>
-          <w:rFonts w:ascii="Myriad Pro" w:hAnsi="Myriad Pro"/>
-          <w:color w:val="002060"/>
-          <w:lang w:val="es-ES"/>
-        </w:rPr>
-        <w:t>các</w:t>
-      </w:r>
-      <w:proofErr w:type="spellEnd"/>
-      <w:r>
-        <w:rPr>
-          <w:rFonts w:ascii="Myriad Pro" w:hAnsi="Myriad Pro"/>
-          <w:color w:val="002060"/>
-          <w:lang w:val="es-ES"/>
-        </w:rPr>
-        <w:t xml:space="preserve"> </w:t>
-      </w:r>
-      <w:proofErr w:type="spellStart"/>
-      <w:r>
-        <w:rPr>
-          <w:rFonts w:ascii="Myriad Pro" w:hAnsi="Myriad Pro"/>
-          <w:color w:val="002060"/>
-          <w:lang w:val="es-ES"/>
-        </w:rPr>
-        <w:t>dự</w:t>
-      </w:r>
-      <w:proofErr w:type="spellEnd"/>
-      <w:r>
-        <w:rPr>
-          <w:rFonts w:ascii="Myriad Pro" w:hAnsi="Myriad Pro"/>
-          <w:color w:val="002060"/>
-          <w:lang w:val="es-ES"/>
-        </w:rPr>
-        <w:t xml:space="preserve"> </w:t>
-      </w:r>
-      <w:proofErr w:type="spellStart"/>
-      <w:r>
-        <w:rPr>
-          <w:rFonts w:ascii="Myriad Pro" w:hAnsi="Myriad Pro"/>
-          <w:color w:val="002060"/>
-          <w:lang w:val="es-ES"/>
-        </w:rPr>
-        <w:t>án</w:t>
-      </w:r>
-      <w:proofErr w:type="spellEnd"/>
-      <w:r>
-        <w:rPr>
-          <w:rFonts w:ascii="Myriad Pro" w:hAnsi="Myriad Pro"/>
-          <w:color w:val="002060"/>
-          <w:lang w:val="es-ES"/>
-        </w:rPr>
-        <w:t xml:space="preserve">, </w:t>
-      </w:r>
-      <w:proofErr w:type="spellStart"/>
-      <w:r>
-        <w:rPr>
-          <w:rFonts w:ascii="Myriad Pro" w:hAnsi="Myriad Pro"/>
-          <w:color w:val="002060"/>
-          <w:lang w:val="es-ES"/>
-        </w:rPr>
-        <w:t>Giám</w:t>
-      </w:r>
-      <w:proofErr w:type="spellEnd"/>
-      <w:r>
-        <w:rPr>
-          <w:rFonts w:ascii="Myriad Pro" w:hAnsi="Myriad Pro"/>
-          <w:color w:val="002060"/>
-          <w:lang w:val="es-ES"/>
-        </w:rPr>
-        <w:t xml:space="preserve"> </w:t>
-      </w:r>
-      <w:proofErr w:type="spellStart"/>
-      <w:r>
-        <w:rPr>
-          <w:rFonts w:ascii="Myriad Pro" w:hAnsi="Myriad Pro"/>
-          <w:color w:val="002060"/>
-          <w:lang w:val="es-ES"/>
-        </w:rPr>
-        <w:t>đốc</w:t>
-      </w:r>
-      <w:proofErr w:type="spellEnd"/>
-      <w:r>
-        <w:rPr>
-          <w:rFonts w:ascii="Myriad Pro" w:hAnsi="Myriad Pro"/>
-          <w:color w:val="002060"/>
-          <w:lang w:val="es-ES"/>
-        </w:rPr>
-        <w:t xml:space="preserve"> </w:t>
-      </w:r>
-      <w:proofErr w:type="spellStart"/>
-      <w:r>
-        <w:rPr>
-          <w:rFonts w:ascii="Myriad Pro" w:hAnsi="Myriad Pro"/>
-          <w:color w:val="002060"/>
-          <w:lang w:val="es-ES"/>
-        </w:rPr>
-        <w:t>có</w:t>
-      </w:r>
-      <w:proofErr w:type="spellEnd"/>
-      <w:r>
-        <w:rPr>
-          <w:rFonts w:ascii="Myriad Pro" w:hAnsi="Myriad Pro"/>
-          <w:color w:val="002060"/>
-          <w:lang w:val="es-ES"/>
-        </w:rPr>
-        <w:t xml:space="preserve"> </w:t>
-      </w:r>
-      <w:proofErr w:type="spellStart"/>
-      <w:r>
-        <w:rPr>
-          <w:rFonts w:ascii="Myriad Pro" w:hAnsi="Myriad Pro"/>
-          <w:color w:val="002060"/>
-          <w:lang w:val="es-ES"/>
-        </w:rPr>
-        <w:t>chỉ</w:t>
-      </w:r>
-      <w:proofErr w:type="spellEnd"/>
-      <w:r>
-        <w:rPr>
-          <w:rFonts w:ascii="Myriad Pro" w:hAnsi="Myriad Pro"/>
-          <w:color w:val="002060"/>
-          <w:lang w:val="es-ES"/>
-        </w:rPr>
-        <w:t xml:space="preserve"> </w:t>
-      </w:r>
-      <w:proofErr w:type="spellStart"/>
-      <w:r>
-        <w:rPr>
-          <w:rFonts w:ascii="Myriad Pro" w:hAnsi="Myriad Pro"/>
-          <w:color w:val="002060"/>
-          <w:lang w:val="es-ES"/>
-        </w:rPr>
-        <w:t>đạo</w:t>
-      </w:r>
-      <w:proofErr w:type="spellEnd"/>
-      <w:r>
-        <w:rPr>
-          <w:rFonts w:ascii="Myriad Pro" w:hAnsi="Myriad Pro"/>
-          <w:color w:val="002060"/>
-          <w:lang w:val="es-ES"/>
-        </w:rPr>
-        <w:t xml:space="preserve"> </w:t>
-      </w:r>
-      <w:proofErr w:type="spellStart"/>
-      <w:r>
-        <w:rPr>
-          <w:rFonts w:ascii="Myriad Pro" w:hAnsi="Myriad Pro"/>
-          <w:color w:val="002060"/>
-          <w:lang w:val="es-ES"/>
-        </w:rPr>
-        <w:t>và</w:t>
-      </w:r>
-      <w:proofErr w:type="spellEnd"/>
-      <w:r>
-        <w:rPr>
-          <w:rFonts w:ascii="Myriad Pro" w:hAnsi="Myriad Pro"/>
-          <w:color w:val="002060"/>
-          <w:lang w:val="es-ES"/>
-        </w:rPr>
-        <w:t xml:space="preserve"> </w:t>
-      </w:r>
-      <w:proofErr w:type="spellStart"/>
-      <w:r>
-        <w:rPr>
-          <w:rFonts w:ascii="Myriad Pro" w:hAnsi="Myriad Pro"/>
-          <w:color w:val="002060"/>
-          <w:lang w:val="es-ES"/>
-        </w:rPr>
-        <w:t>kết</w:t>
-      </w:r>
-      <w:proofErr w:type="spellEnd"/>
-      <w:r>
-        <w:rPr>
-          <w:rFonts w:ascii="Myriad Pro" w:hAnsi="Myriad Pro"/>
-          <w:color w:val="002060"/>
-          <w:lang w:val="es-ES"/>
-        </w:rPr>
-        <w:t xml:space="preserve"> </w:t>
-      </w:r>
-      <w:proofErr w:type="spellStart"/>
-      <w:r>
-        <w:rPr>
-          <w:rFonts w:ascii="Myriad Pro" w:hAnsi="Myriad Pro"/>
-          <w:color w:val="002060"/>
-          <w:lang w:val="es-ES"/>
-        </w:rPr>
-        <w:t>luận</w:t>
-      </w:r>
-      <w:proofErr w:type="spellEnd"/>
-      <w:r>
-        <w:rPr>
-          <w:rFonts w:ascii="Myriad Pro" w:hAnsi="Myriad Pro"/>
-          <w:color w:val="002060"/>
-          <w:lang w:val="es-ES"/>
-        </w:rPr>
-        <w:t xml:space="preserve"> </w:t>
-      </w:r>
-      <w:proofErr w:type="spellStart"/>
-      <w:r>
-        <w:rPr>
-          <w:rFonts w:ascii="Myriad Pro" w:hAnsi="Myriad Pro"/>
-          <w:color w:val="002060"/>
-          <w:lang w:val="es-ES"/>
-        </w:rPr>
-        <w:t>nội</w:t>
-      </w:r>
-      <w:proofErr w:type="spellEnd"/>
-      <w:r>
-        <w:rPr>
-          <w:rFonts w:ascii="Myriad Pro" w:hAnsi="Myriad Pro"/>
-          <w:color w:val="002060"/>
-          <w:lang w:val="es-ES"/>
-        </w:rPr>
-        <w:t xml:space="preserve"> </w:t>
-      </w:r>
-      <w:proofErr w:type="spellStart"/>
-      <w:r>
-        <w:rPr>
-          <w:rFonts w:ascii="Myriad Pro" w:hAnsi="Myriad Pro"/>
-          <w:color w:val="002060"/>
-          <w:lang w:val="es-ES"/>
-        </w:rPr>
-        <w:t>dung</w:t>
-      </w:r>
-      <w:proofErr w:type="spellEnd"/>
-      <w:r>
-        <w:rPr>
-          <w:rFonts w:ascii="Myriad Pro" w:hAnsi="Myriad Pro"/>
-          <w:color w:val="002060"/>
-          <w:lang w:val="es-ES"/>
-        </w:rPr>
-        <w:t xml:space="preserve"> </w:t>
-      </w:r>
-      <w:proofErr w:type="spellStart"/>
-      <w:r>
-        <w:rPr>
-          <w:rFonts w:ascii="Myriad Pro" w:hAnsi="Myriad Pro"/>
-          <w:color w:val="002060"/>
-          <w:lang w:val="es-ES"/>
-        </w:rPr>
-        <w:t>cuộc</w:t>
-      </w:r>
-      <w:proofErr w:type="spellEnd"/>
-      <w:r>
-        <w:rPr>
-          <w:rFonts w:ascii="Myriad Pro" w:hAnsi="Myriad Pro"/>
-          <w:color w:val="002060"/>
-          <w:lang w:val="es-ES"/>
-        </w:rPr>
-        <w:t xml:space="preserve"> </w:t>
-      </w:r>
-      <w:proofErr w:type="spellStart"/>
-      <w:r>
-        <w:rPr>
-          <w:rFonts w:ascii="Myriad Pro" w:hAnsi="Myriad Pro"/>
-          <w:color w:val="002060"/>
-          <w:lang w:val="es-ES"/>
-        </w:rPr>
-        <w:t>họp</w:t>
-      </w:r>
-      <w:proofErr w:type="spellEnd"/>
-      <w:r>
-        <w:rPr>
-          <w:rFonts w:ascii="Myriad Pro" w:hAnsi="Myriad Pro"/>
-          <w:color w:val="002060"/>
-          <w:lang w:val="es-ES"/>
-        </w:rPr>
-        <w:t xml:space="preserve"> </w:t>
-      </w:r>
-      <w:proofErr w:type="spellStart"/>
-      <w:r>
-        <w:rPr>
-          <w:rFonts w:ascii="Myriad Pro" w:hAnsi="Myriad Pro"/>
-          <w:color w:val="002060"/>
-          <w:lang w:val="es-ES"/>
-        </w:rPr>
-        <w:t>như</w:t>
-      </w:r>
-      <w:proofErr w:type="spellEnd"/>
-      <w:r>
-        <w:rPr>
-          <w:rFonts w:ascii="Myriad Pro" w:hAnsi="Myriad Pro"/>
-          <w:color w:val="002060"/>
-          <w:lang w:val="es-ES"/>
-        </w:rPr>
-        <w:t xml:space="preserve"> </w:t>
-      </w:r>
-      <w:proofErr w:type="spellStart"/>
-      <w:r>
-        <w:rPr>
-          <w:rFonts w:ascii="Myriad Pro" w:hAnsi="Myriad Pro"/>
-          <w:color w:val="002060"/>
-          <w:lang w:val="es-ES"/>
-        </w:rPr>
-        <w:t>sau</w:t>
-      </w:r>
-      <w:proofErr w:type="spellEnd"/>
-      <w:r>
-        <w:rPr>
-          <w:rFonts w:ascii="Myriad Pro" w:hAnsi="Myriad Pro"/>
-          <w:color w:val="002060"/>
-          <w:lang w:val="es-ES"/>
-        </w:rPr>
-        <w:t>:</w:t>
+      <w:r>
+        <w:t>{meeting_summary}</w:t>
+        <w:br/>
+        <w:br/>
+        <w:t>Sau khi thảo luận, Chủ trì cuộc họp kết luận và chỉ đạo thực hiện các đầu việc chi tiết như sau:</w:t>
       </w:r>
     </w:p>
     <w:tbl>
@@ -1284,11 +487,11 @@
         <w:tblLook w:val="04A0" w:firstRow="1" w:lastRow="0" w:firstColumn="1" w:lastColumn="0" w:noHBand="0" w:noVBand="1"/>
       </w:tblPr>
       <w:tblGrid>
-        <w:gridCol w:w="1504"/>
-        <w:gridCol w:w="3853"/>
-        <w:gridCol w:w="1733"/>
-        <w:gridCol w:w="1424"/>
-        <w:gridCol w:w="2118"/>
+        <w:gridCol w:w="1064"/>
+        <w:gridCol w:w="4169"/>
+        <w:gridCol w:w="1788"/>
+        <w:gridCol w:w="1484"/>
+        <w:gridCol w:w="2127"/>
       </w:tblGrid>
       <w:tr>
         <w:trPr>
@@ -1478,7 +681,6 @@
           <w:tcPr>
             <w:tcW w:w="4169" w:type="dxa"/>
           </w:tcPr>
-          <w:p/>
           <w:p>
             <w:r>
               <w:t>{content}</w:t>
@@ -1574,39 +776,505 @@
         <w:jc w:val="both"/>
         <w:rPr>
           <w:rFonts w:ascii="Myriad Pro" w:hAnsi="Myriad Pro"/>
-        </w:rPr>
-      </w:pPr>
+          <w:color w:val="2F5496" w:themeColor="accent1" w:themeShade="BF"/>
+        </w:rPr>
+      </w:pPr>
+      <w:r>
+        <w:rPr>
+          <w:rFonts w:ascii="Myriad Pro" w:hAnsi="Myriad Pro"/>
+          <w:color w:val="2F5496" w:themeColor="accent1" w:themeShade="BF"/>
+        </w:rPr>
+        <w:t xml:space="preserve">Theo </w:t>
+      </w:r>
       <w:proofErr w:type="spellStart"/>
       <w:r>
-        <w:t>Cuộc</w:t>
+        <w:rPr>
+          <w:rFonts w:ascii="Myriad Pro" w:hAnsi="Myriad Pro"/>
+          <w:color w:val="2F5496" w:themeColor="accent1" w:themeShade="BF"/>
+        </w:rPr>
+        <w:t>nội</w:t>
       </w:r>
       <w:proofErr w:type="spellEnd"/>
       <w:r>
+        <w:rPr>
+          <w:rFonts w:ascii="Myriad Pro" w:hAnsi="Myriad Pro"/>
+          <w:color w:val="2F5496" w:themeColor="accent1" w:themeShade="BF"/>
+        </w:rPr>
+        <w:t xml:space="preserve"> dung </w:t>
+      </w:r>
+      <w:proofErr w:type="spellStart"/>
+      <w:r>
+        <w:rPr>
+          <w:rFonts w:ascii="Myriad Pro" w:hAnsi="Myriad Pro"/>
+          <w:color w:val="2F5496" w:themeColor="accent1" w:themeShade="BF"/>
+        </w:rPr>
+        <w:t>thảo</w:t>
+      </w:r>
+      <w:proofErr w:type="spellEnd"/>
+      <w:r>
+        <w:rPr>
+          <w:rFonts w:ascii="Myriad Pro" w:hAnsi="Myriad Pro"/>
+          <w:color w:val="2F5496" w:themeColor="accent1" w:themeShade="BF"/>
+        </w:rPr>
         <w:t xml:space="preserve"> </w:t>
       </w:r>
       <w:proofErr w:type="spellStart"/>
       <w:r>
+        <w:rPr>
+          <w:rFonts w:ascii="Myriad Pro" w:hAnsi="Myriad Pro"/>
+          <w:color w:val="2F5496" w:themeColor="accent1" w:themeShade="BF"/>
+        </w:rPr>
+        <w:t>lu</w:t>
+      </w:r>
+      <w:r>
+        <w:rPr>
+          <w:rFonts w:ascii="Myriad Pro" w:hAnsi="Myriad Pro"/>
+          <w:color w:val="2F5496" w:themeColor="accent1" w:themeShade="BF"/>
+        </w:rPr>
+        <w:softHyphen/>
+      </w:r>
+      <w:r>
+        <w:rPr>
+          <w:rFonts w:ascii="Myriad Pro" w:hAnsi="Myriad Pro"/>
+          <w:color w:val="2F5496" w:themeColor="accent1" w:themeShade="BF"/>
+        </w:rPr>
+        <w:softHyphen/>
+      </w:r>
+      <w:r>
+        <w:rPr>
+          <w:rFonts w:ascii="Myriad Pro" w:hAnsi="Myriad Pro"/>
+          <w:color w:val="2F5496" w:themeColor="accent1" w:themeShade="BF"/>
+        </w:rPr>
+        <w:softHyphen/>
+        <w:t>ận</w:t>
+      </w:r>
+      <w:proofErr w:type="spellEnd"/>
+      <w:r>
+        <w:rPr>
+          <w:rFonts w:ascii="Myriad Pro" w:hAnsi="Myriad Pro"/>
+          <w:color w:val="2F5496" w:themeColor="accent1" w:themeShade="BF"/>
+        </w:rPr>
+        <w:t xml:space="preserve"> </w:t>
+      </w:r>
+      <w:proofErr w:type="spellStart"/>
+      <w:r>
+        <w:rPr>
+          <w:rFonts w:ascii="Myriad Pro" w:hAnsi="Myriad Pro"/>
+          <w:color w:val="2F5496" w:themeColor="accent1" w:themeShade="BF"/>
+        </w:rPr>
+        <w:t>và</w:t>
+      </w:r>
+      <w:proofErr w:type="spellEnd"/>
+      <w:r>
+        <w:rPr>
+          <w:rFonts w:ascii="Myriad Pro" w:hAnsi="Myriad Pro"/>
+          <w:color w:val="2F5496" w:themeColor="accent1" w:themeShade="BF"/>
+        </w:rPr>
+        <w:t xml:space="preserve"> </w:t>
+      </w:r>
+      <w:proofErr w:type="spellStart"/>
+      <w:r>
+        <w:rPr>
+          <w:rFonts w:ascii="Myriad Pro" w:hAnsi="Myriad Pro"/>
+          <w:color w:val="2F5496" w:themeColor="accent1" w:themeShade="BF"/>
+        </w:rPr>
+        <w:t>chỉ</w:t>
+      </w:r>
+      <w:proofErr w:type="spellEnd"/>
+      <w:r>
+        <w:rPr>
+          <w:rFonts w:ascii="Myriad Pro" w:hAnsi="Myriad Pro"/>
+          <w:color w:val="2F5496" w:themeColor="accent1" w:themeShade="BF"/>
+        </w:rPr>
+        <w:t xml:space="preserve"> </w:t>
+      </w:r>
+      <w:proofErr w:type="spellStart"/>
+      <w:r>
+        <w:rPr>
+          <w:rFonts w:ascii="Myriad Pro" w:hAnsi="Myriad Pro"/>
+          <w:color w:val="2F5496" w:themeColor="accent1" w:themeShade="BF"/>
+        </w:rPr>
+        <w:t>đạo</w:t>
+      </w:r>
+      <w:proofErr w:type="spellEnd"/>
+      <w:r>
+        <w:rPr>
+          <w:rFonts w:ascii="Myriad Pro" w:hAnsi="Myriad Pro"/>
+          <w:color w:val="2F5496" w:themeColor="accent1" w:themeShade="BF"/>
+        </w:rPr>
+        <w:t xml:space="preserve"> </w:t>
+      </w:r>
+      <w:proofErr w:type="spellStart"/>
+      <w:r>
+        <w:rPr>
+          <w:rFonts w:ascii="Myriad Pro" w:hAnsi="Myriad Pro"/>
+          <w:color w:val="2F5496" w:themeColor="accent1" w:themeShade="BF"/>
+        </w:rPr>
+        <w:t>của</w:t>
+      </w:r>
+      <w:proofErr w:type="spellEnd"/>
+      <w:r>
+        <w:rPr>
+          <w:rFonts w:ascii="Myriad Pro" w:hAnsi="Myriad Pro"/>
+          <w:color w:val="2F5496" w:themeColor="accent1" w:themeShade="BF"/>
+        </w:rPr>
+        <w:t xml:space="preserve"> </w:t>
+      </w:r>
+      <w:proofErr w:type="spellStart"/>
+      <w:r>
+        <w:rPr>
+          <w:rFonts w:ascii="Myriad Pro" w:hAnsi="Myriad Pro"/>
+          <w:color w:val="2F5496" w:themeColor="accent1" w:themeShade="BF"/>
+        </w:rPr>
+        <w:t>Giám</w:t>
+      </w:r>
+      <w:proofErr w:type="spellEnd"/>
+      <w:r>
+        <w:rPr>
+          <w:rFonts w:ascii="Myriad Pro" w:hAnsi="Myriad Pro"/>
+          <w:color w:val="2F5496" w:themeColor="accent1" w:themeShade="BF"/>
+        </w:rPr>
+        <w:t xml:space="preserve"> </w:t>
+      </w:r>
+      <w:proofErr w:type="spellStart"/>
+      <w:r>
+        <w:rPr>
+          <w:rFonts w:ascii="Myriad Pro" w:hAnsi="Myriad Pro"/>
+          <w:color w:val="2F5496" w:themeColor="accent1" w:themeShade="BF"/>
+        </w:rPr>
+        <w:t>đốc</w:t>
+      </w:r>
+      <w:proofErr w:type="spellEnd"/>
+      <w:r>
+        <w:rPr>
+          <w:rFonts w:ascii="Myriad Pro" w:hAnsi="Myriad Pro"/>
+          <w:color w:val="2F5496" w:themeColor="accent1" w:themeShade="BF"/>
+        </w:rPr>
+        <w:t xml:space="preserve"> </w:t>
+      </w:r>
+      <w:proofErr w:type="spellStart"/>
+      <w:r>
+        <w:rPr>
+          <w:rFonts w:ascii="Myriad Pro" w:hAnsi="Myriad Pro"/>
+          <w:color w:val="2F5496" w:themeColor="accent1" w:themeShade="BF"/>
+        </w:rPr>
+        <w:t>trong</w:t>
+      </w:r>
+      <w:proofErr w:type="spellEnd"/>
+      <w:r>
+        <w:rPr>
+          <w:rFonts w:ascii="Myriad Pro" w:hAnsi="Myriad Pro"/>
+          <w:color w:val="2F5496" w:themeColor="accent1" w:themeShade="BF"/>
+        </w:rPr>
+        <w:t xml:space="preserve"> </w:t>
+      </w:r>
+      <w:proofErr w:type="spellStart"/>
+      <w:r>
+        <w:rPr>
+          <w:rFonts w:ascii="Myriad Pro" w:hAnsi="Myriad Pro"/>
+          <w:color w:val="2F5496" w:themeColor="accent1" w:themeShade="BF"/>
+        </w:rPr>
+        <w:t>cuộc</w:t>
+      </w:r>
+      <w:proofErr w:type="spellEnd"/>
+      <w:r>
+        <w:rPr>
+          <w:rFonts w:ascii="Myriad Pro" w:hAnsi="Myriad Pro"/>
+          <w:color w:val="2F5496" w:themeColor="accent1" w:themeShade="BF"/>
+        </w:rPr>
+        <w:t xml:space="preserve"> </w:t>
+      </w:r>
+      <w:proofErr w:type="spellStart"/>
+      <w:r>
+        <w:rPr>
+          <w:rFonts w:ascii="Myriad Pro" w:hAnsi="Myriad Pro"/>
+          <w:color w:val="2F5496" w:themeColor="accent1" w:themeShade="BF"/>
+        </w:rPr>
         <w:t>họp</w:t>
       </w:r>
       <w:proofErr w:type="spellEnd"/>
       <w:r>
+        <w:rPr>
+          <w:rFonts w:ascii="Myriad Pro" w:hAnsi="Myriad Pro"/>
+          <w:color w:val="2F5496" w:themeColor="accent1" w:themeShade="BF"/>
+        </w:rPr>
+        <w:t xml:space="preserve">, </w:t>
+      </w:r>
+      <w:proofErr w:type="spellStart"/>
+      <w:r>
+        <w:rPr>
+          <w:rFonts w:ascii="Myriad Pro" w:hAnsi="Myriad Pro"/>
+          <w:color w:val="2F5496" w:themeColor="accent1" w:themeShade="BF"/>
+        </w:rPr>
+        <w:t>cá</w:t>
+      </w:r>
+      <w:proofErr w:type="spellEnd"/>
+      <w:r>
+        <w:rPr>
+          <w:rFonts w:ascii="Myriad Pro" w:hAnsi="Myriad Pro"/>
+          <w:color w:val="2F5496" w:themeColor="accent1" w:themeShade="BF"/>
+        </w:rPr>
         <w:t xml:space="preserve"> </w:t>
       </w:r>
       <w:proofErr w:type="spellStart"/>
       <w:r>
-        <w:t>kết</w:t>
+        <w:rPr>
+          <w:rFonts w:ascii="Myriad Pro" w:hAnsi="Myriad Pro"/>
+          <w:color w:val="2F5496" w:themeColor="accent1" w:themeShade="BF"/>
+        </w:rPr>
+        <w:t>nhân</w:t>
       </w:r>
       <w:proofErr w:type="spellEnd"/>
       <w:r>
+        <w:rPr>
+          <w:rFonts w:ascii="Myriad Pro" w:hAnsi="Myriad Pro"/>
+          <w:color w:val="2F5496" w:themeColor="accent1" w:themeShade="BF"/>
+        </w:rPr>
+        <w:t xml:space="preserve">, </w:t>
+      </w:r>
+      <w:proofErr w:type="spellStart"/>
+      <w:r>
+        <w:rPr>
+          <w:rFonts w:ascii="Myriad Pro" w:hAnsi="Myriad Pro"/>
+          <w:color w:val="2F5496" w:themeColor="accent1" w:themeShade="BF"/>
+        </w:rPr>
+        <w:t>đơn</w:t>
+      </w:r>
+      <w:proofErr w:type="spellEnd"/>
+      <w:r>
+        <w:rPr>
+          <w:rFonts w:ascii="Myriad Pro" w:hAnsi="Myriad Pro"/>
+          <w:color w:val="2F5496" w:themeColor="accent1" w:themeShade="BF"/>
+        </w:rPr>
         <w:t xml:space="preserve"> </w:t>
       </w:r>
       <w:proofErr w:type="spellStart"/>
       <w:r>
-        <w:t>thúc</w:t>
+        <w:rPr>
+          <w:rFonts w:ascii="Myriad Pro" w:hAnsi="Myriad Pro"/>
+          <w:color w:val="2F5496" w:themeColor="accent1" w:themeShade="BF"/>
+        </w:rPr>
+        <w:t>vị</w:t>
       </w:r>
       <w:proofErr w:type="spellEnd"/>
       <w:r>
-        <w:t xml:space="preserve"> vào lúc {end_time} cùng ngày. Biên bản họp đã được các thành viên thông qua và thực hiện các công việc theo đúng thời gian đã cam kết.</w:t>
+        <w:rPr>
+          <w:rFonts w:ascii="Myriad Pro" w:hAnsi="Myriad Pro"/>
+          <w:color w:val="2F5496" w:themeColor="accent1" w:themeShade="BF"/>
+        </w:rPr>
+        <w:t xml:space="preserve"> </w:t>
+      </w:r>
+      <w:proofErr w:type="spellStart"/>
+      <w:r>
+        <w:rPr>
+          <w:rFonts w:ascii="Myriad Pro" w:hAnsi="Myriad Pro"/>
+          <w:color w:val="2F5496" w:themeColor="accent1" w:themeShade="BF"/>
+        </w:rPr>
+        <w:t>có</w:t>
+      </w:r>
+      <w:proofErr w:type="spellEnd"/>
+      <w:r>
+        <w:rPr>
+          <w:rFonts w:ascii="Myriad Pro" w:hAnsi="Myriad Pro"/>
+          <w:color w:val="2F5496" w:themeColor="accent1" w:themeShade="BF"/>
+        </w:rPr>
+        <w:t xml:space="preserve"> </w:t>
+      </w:r>
+      <w:proofErr w:type="spellStart"/>
+      <w:r>
+        <w:rPr>
+          <w:rFonts w:ascii="Myriad Pro" w:hAnsi="Myriad Pro"/>
+          <w:color w:val="2F5496" w:themeColor="accent1" w:themeShade="BF"/>
+        </w:rPr>
+        <w:t>trách</w:t>
+      </w:r>
+      <w:proofErr w:type="spellEnd"/>
+      <w:r>
+        <w:rPr>
+          <w:rFonts w:ascii="Myriad Pro" w:hAnsi="Myriad Pro"/>
+          <w:color w:val="2F5496" w:themeColor="accent1" w:themeShade="BF"/>
+        </w:rPr>
+        <w:t xml:space="preserve"> </w:t>
+      </w:r>
+      <w:proofErr w:type="spellStart"/>
+      <w:r>
+        <w:rPr>
+          <w:rFonts w:ascii="Myriad Pro" w:hAnsi="Myriad Pro"/>
+          <w:color w:val="2F5496" w:themeColor="accent1" w:themeShade="BF"/>
+        </w:rPr>
+        <w:t>nhiệm</w:t>
+      </w:r>
+      <w:proofErr w:type="spellEnd"/>
+      <w:r>
+        <w:rPr>
+          <w:rFonts w:ascii="Myriad Pro" w:hAnsi="Myriad Pro"/>
+          <w:color w:val="2F5496" w:themeColor="accent1" w:themeShade="BF"/>
+        </w:rPr>
+        <w:t xml:space="preserve"> </w:t>
+      </w:r>
+      <w:proofErr w:type="spellStart"/>
+      <w:r>
+        <w:rPr>
+          <w:rFonts w:ascii="Myriad Pro" w:hAnsi="Myriad Pro"/>
+          <w:color w:val="2F5496" w:themeColor="accent1" w:themeShade="BF"/>
+        </w:rPr>
+        <w:t>thực</w:t>
+      </w:r>
+      <w:proofErr w:type="spellEnd"/>
+      <w:r>
+        <w:rPr>
+          <w:rFonts w:ascii="Myriad Pro" w:hAnsi="Myriad Pro"/>
+          <w:color w:val="2F5496" w:themeColor="accent1" w:themeShade="BF"/>
+        </w:rPr>
+        <w:t xml:space="preserve"> </w:t>
+      </w:r>
+      <w:proofErr w:type="spellStart"/>
+      <w:r>
+        <w:rPr>
+          <w:rFonts w:ascii="Myriad Pro" w:hAnsi="Myriad Pro"/>
+          <w:color w:val="2F5496" w:themeColor="accent1" w:themeShade="BF"/>
+        </w:rPr>
+        <w:t>hiện</w:t>
+      </w:r>
+      <w:proofErr w:type="spellEnd"/>
+      <w:r>
+        <w:rPr>
+          <w:rFonts w:ascii="Myriad Pro" w:hAnsi="Myriad Pro"/>
+          <w:color w:val="2F5496" w:themeColor="accent1" w:themeShade="BF"/>
+        </w:rPr>
+        <w:t xml:space="preserve">, </w:t>
+      </w:r>
+      <w:proofErr w:type="spellStart"/>
+      <w:r>
+        <w:rPr>
+          <w:rFonts w:ascii="Myriad Pro" w:hAnsi="Myriad Pro"/>
+          <w:color w:val="2F5496" w:themeColor="accent1" w:themeShade="BF"/>
+        </w:rPr>
+        <w:t>kiểm</w:t>
+      </w:r>
+      <w:proofErr w:type="spellEnd"/>
+      <w:r>
+        <w:rPr>
+          <w:rFonts w:ascii="Myriad Pro" w:hAnsi="Myriad Pro"/>
+          <w:color w:val="2F5496" w:themeColor="accent1" w:themeShade="BF"/>
+        </w:rPr>
+        <w:t xml:space="preserve"> </w:t>
+      </w:r>
+      <w:proofErr w:type="spellStart"/>
+      <w:r>
+        <w:rPr>
+          <w:rFonts w:ascii="Myriad Pro" w:hAnsi="Myriad Pro"/>
+          <w:color w:val="2F5496" w:themeColor="accent1" w:themeShade="BF"/>
+        </w:rPr>
+        <w:t>soát</w:t>
+      </w:r>
+      <w:proofErr w:type="spellEnd"/>
+      <w:r>
+        <w:rPr>
+          <w:rFonts w:ascii="Myriad Pro" w:hAnsi="Myriad Pro"/>
+          <w:color w:val="2F5496" w:themeColor="accent1" w:themeShade="BF"/>
+        </w:rPr>
+        <w:t xml:space="preserve"> </w:t>
+      </w:r>
+      <w:proofErr w:type="spellStart"/>
+      <w:r>
+        <w:rPr>
+          <w:rFonts w:ascii="Myriad Pro" w:hAnsi="Myriad Pro"/>
+          <w:color w:val="2F5496" w:themeColor="accent1" w:themeShade="BF"/>
+        </w:rPr>
+        <w:t>công</w:t>
+      </w:r>
+      <w:proofErr w:type="spellEnd"/>
+      <w:r>
+        <w:rPr>
+          <w:rFonts w:ascii="Myriad Pro" w:hAnsi="Myriad Pro"/>
+          <w:color w:val="2F5496" w:themeColor="accent1" w:themeShade="BF"/>
+        </w:rPr>
+        <w:t xml:space="preserve"> </w:t>
+      </w:r>
+      <w:proofErr w:type="spellStart"/>
+      <w:r>
+        <w:rPr>
+          <w:rFonts w:ascii="Myriad Pro" w:hAnsi="Myriad Pro"/>
+          <w:color w:val="2F5496" w:themeColor="accent1" w:themeShade="BF"/>
+        </w:rPr>
+        <w:t>việc</w:t>
+      </w:r>
+      <w:proofErr w:type="spellEnd"/>
+      <w:r>
+        <w:rPr>
+          <w:rFonts w:ascii="Myriad Pro" w:hAnsi="Myriad Pro"/>
+          <w:color w:val="2F5496" w:themeColor="accent1" w:themeShade="BF"/>
+        </w:rPr>
+        <w:t xml:space="preserve"> </w:t>
+      </w:r>
+      <w:proofErr w:type="spellStart"/>
+      <w:r>
+        <w:rPr>
+          <w:rFonts w:ascii="Myriad Pro" w:hAnsi="Myriad Pro"/>
+          <w:color w:val="2F5496" w:themeColor="accent1" w:themeShade="BF"/>
+        </w:rPr>
+        <w:t>được</w:t>
+      </w:r>
+      <w:proofErr w:type="spellEnd"/>
+      <w:r>
+        <w:rPr>
+          <w:rFonts w:ascii="Myriad Pro" w:hAnsi="Myriad Pro"/>
+          <w:color w:val="2F5496" w:themeColor="accent1" w:themeShade="BF"/>
+        </w:rPr>
+        <w:t xml:space="preserve"> </w:t>
+      </w:r>
+      <w:proofErr w:type="spellStart"/>
+      <w:r>
+        <w:rPr>
+          <w:rFonts w:ascii="Myriad Pro" w:hAnsi="Myriad Pro"/>
+          <w:color w:val="2F5496" w:themeColor="accent1" w:themeShade="BF"/>
+        </w:rPr>
+        <w:t>phân</w:t>
+      </w:r>
+      <w:proofErr w:type="spellEnd"/>
+      <w:r>
+        <w:rPr>
+          <w:rFonts w:ascii="Myriad Pro" w:hAnsi="Myriad Pro"/>
+          <w:color w:val="2F5496" w:themeColor="accent1" w:themeShade="BF"/>
+        </w:rPr>
+        <w:t xml:space="preserve"> </w:t>
+      </w:r>
+      <w:proofErr w:type="spellStart"/>
+      <w:r>
+        <w:rPr>
+          <w:rFonts w:ascii="Myriad Pro" w:hAnsi="Myriad Pro"/>
+          <w:color w:val="2F5496" w:themeColor="accent1" w:themeShade="BF"/>
+        </w:rPr>
+        <w:t>công</w:t>
+      </w:r>
+      <w:proofErr w:type="spellEnd"/>
+      <w:r>
+        <w:rPr>
+          <w:rFonts w:ascii="Myriad Pro" w:hAnsi="Myriad Pro"/>
+          <w:color w:val="2F5496" w:themeColor="accent1" w:themeShade="BF"/>
+        </w:rPr>
+        <w:t>.</w:t>
+      </w:r>
+    </w:p>
+    <w:p>
+      <w:pPr>
+        <w:pStyle w:val="ListParagraph"/>
+        <w:numPr>
+          <w:ilvl w:val="0"/>
+          <w:numId w:val="1"/>
+        </w:numPr>
+        <w:spacing w:line="295" w:lineRule="auto"/>
+        <w:ind w:left="0" w:firstLine="567"/>
+        <w:contextualSpacing w:val="0"/>
+        <w:jc w:val="both"/>
+        <w:rPr>
+          <w:rFonts w:ascii="Myriad Pro" w:hAnsi="Myriad Pro"/>
+          <w:color w:val="2F5496" w:themeColor="accent1" w:themeShade="BF"/>
+        </w:rPr>
+      </w:pPr>
+      <w:r>
+        <w:t>Cuộc họp kết thúc vào lúc {end_time} cùng ngày. Biên bản họp đã được các thành viên thông qua và thực hiện các công việc theo đúng thời gian đã cam kết.</w:t>
       </w:r>
     </w:p>
     <w:p>
@@ -1636,72 +1304,14 @@
             <w:tcW w:w="4815" w:type="dxa"/>
           </w:tcPr>
           <w:p>
-            <w:pPr>
-              <w:ind w:left="1425"/>
-              <w:rPr>
-                <w:b/>
-                <w:bCs/>
-                <w:color w:val="2F5496" w:themeColor="accent1" w:themeShade="BF"/>
-              </w:rPr>
-            </w:pPr>
             <w:r>
-              <w:rPr>
-                <w:b/>
-                <w:bCs/>
-                <w:color w:val="2F5496" w:themeColor="accent1" w:themeShade="BF"/>
-              </w:rPr>
               <w:t>THƯ KÝ</w:t>
-            </w:r>
-            <w:r>
-              <w:rPr>
-                <w:b/>
-                <w:bCs/>
-                <w:color w:val="2F5496" w:themeColor="accent1" w:themeShade="BF"/>
-              </w:rPr>
               <w:br/>
-            </w:r>
-            <w:r>
-              <w:rPr>
-                <w:b/>
-                <w:bCs/>
-                <w:color w:val="2F5496" w:themeColor="accent1" w:themeShade="BF"/>
-              </w:rPr>
               <w:br/>
-            </w:r>
-            <w:r>
-              <w:rPr>
-                <w:b/>
-                <w:bCs/>
-                <w:color w:val="2F5496" w:themeColor="accent1" w:themeShade="BF"/>
-              </w:rPr>
               <w:br/>
-            </w:r>
-            <w:r>
-              <w:rPr>
-                <w:b/>
-                <w:bCs/>
-                <w:color w:val="2F5496" w:themeColor="accent1" w:themeShade="BF"/>
-              </w:rPr>
               <w:br/>
-              <w:t>{</w:t>
-            </w:r>
-            <w:proofErr w:type="spellStart"/>
-            <w:r>
-              <w:rPr>
-                <w:b/>
-                <w:bCs/>
-                <w:color w:val="2F5496" w:themeColor="accent1" w:themeShade="BF"/>
-              </w:rPr>
-              <w:t>sec_name</w:t>
-            </w:r>
-            <w:proofErr w:type="spellEnd"/>
-            <w:r>
-              <w:rPr>
-                <w:b/>
-                <w:bCs/>
-                <w:color w:val="2F5496" w:themeColor="accent1" w:themeShade="BF"/>
-              </w:rPr>
-              <w:t>}</w:t>
+              <w:br/>
+              <w:t>{sec_name}</w:t>
             </w:r>
           </w:p>
         </w:tc>
@@ -1710,72 +1320,14 @@
             <w:tcW w:w="4819" w:type="dxa"/>
           </w:tcPr>
           <w:p>
-            <w:pPr>
-              <w:ind w:left="1425"/>
-              <w:rPr>
-                <w:b/>
-                <w:bCs/>
-                <w:color w:val="2F5496" w:themeColor="accent1" w:themeShade="BF"/>
-              </w:rPr>
-            </w:pPr>
             <w:r>
-              <w:rPr>
-                <w:b/>
-                <w:bCs/>
-                <w:color w:val="2F5496" w:themeColor="accent1" w:themeShade="BF"/>
-              </w:rPr>
               <w:t>CHỦ TRÌ</w:t>
-            </w:r>
-            <w:r>
-              <w:rPr>
-                <w:b/>
-                <w:bCs/>
-                <w:color w:val="2F5496" w:themeColor="accent1" w:themeShade="BF"/>
-              </w:rPr>
               <w:br/>
-            </w:r>
-            <w:r>
-              <w:rPr>
-                <w:b/>
-                <w:bCs/>
-                <w:color w:val="2F5496" w:themeColor="accent1" w:themeShade="BF"/>
-              </w:rPr>
               <w:br/>
-            </w:r>
-            <w:r>
-              <w:rPr>
-                <w:b/>
-                <w:bCs/>
-                <w:color w:val="2F5496" w:themeColor="accent1" w:themeShade="BF"/>
-              </w:rPr>
               <w:br/>
-            </w:r>
-            <w:r>
-              <w:rPr>
-                <w:b/>
-                <w:bCs/>
-                <w:color w:val="2F5496" w:themeColor="accent1" w:themeShade="BF"/>
-              </w:rPr>
               <w:br/>
-              <w:t>{</w:t>
-            </w:r>
-            <w:proofErr w:type="spellStart"/>
-            <w:r>
-              <w:rPr>
-                <w:b/>
-                <w:bCs/>
-                <w:color w:val="2F5496" w:themeColor="accent1" w:themeShade="BF"/>
-              </w:rPr>
-              <w:t>chair_name</w:t>
-            </w:r>
-            <w:proofErr w:type="spellEnd"/>
-            <w:r>
-              <w:rPr>
-                <w:b/>
-                <w:bCs/>
-                <w:color w:val="2F5496" w:themeColor="accent1" w:themeShade="BF"/>
-              </w:rPr>
-              <w:t>}</w:t>
+              <w:br/>
+              <w:t>{chair_name}</w:t>
             </w:r>
           </w:p>
         </w:tc>
@@ -1788,7 +1340,6 @@
         <w:rPr>
           <w:rFonts w:ascii="Myriad Pro" w:hAnsi="Myriad Pro"/>
           <w:b/>
-          <w:bCs/>
           <w:i/>
           <w:color w:val="2F5496" w:themeColor="accent1" w:themeShade="BF"/>
         </w:rPr>
@@ -1798,7 +1349,6 @@
         <w:rPr>
           <w:rFonts w:ascii="Myriad Pro" w:hAnsi="Myriad Pro"/>
           <w:b/>
-          <w:bCs/>
           <w:i/>
           <w:color w:val="2F5496" w:themeColor="accent1" w:themeShade="BF"/>
         </w:rPr>
@@ -1809,7 +1359,6 @@
         <w:rPr>
           <w:rFonts w:ascii="Myriad Pro" w:hAnsi="Myriad Pro"/>
           <w:b/>
-          <w:bCs/>
           <w:i/>
           <w:color w:val="2F5496" w:themeColor="accent1" w:themeShade="BF"/>
         </w:rPr>
@@ -1820,7 +1369,6 @@
         <w:rPr>
           <w:rFonts w:ascii="Myriad Pro" w:hAnsi="Myriad Pro"/>
           <w:b/>
-          <w:bCs/>
           <w:i/>
           <w:color w:val="2F5496" w:themeColor="accent1" w:themeShade="BF"/>
         </w:rPr>
@@ -1831,7 +1379,6 @@
         <w:rPr>
           <w:rFonts w:ascii="Myriad Pro" w:hAnsi="Myriad Pro"/>
           <w:b/>
-          <w:bCs/>
           <w:i/>
           <w:color w:val="2F5496" w:themeColor="accent1" w:themeShade="BF"/>
         </w:rPr>
@@ -7103,30 +6650,6 @@
 </file>
 
 <file path=customXml/item1.xml><?xml version="1.0" encoding="utf-8"?>
-<?mso-contentType ?>
-<FormTemplates xmlns="http://schemas.microsoft.com/sharepoint/v3/contenttype/forms">
-  <Display>DocumentLibraryForm</Display>
-  <Edit>DocumentLibraryForm</Edit>
-  <New>DocumentLibraryForm</New>
-</FormTemplates>
-</file>
-
-<file path=customXml/item2.xml><?xml version="1.0" encoding="utf-8"?>
-<p:properties xmlns:p="http://schemas.microsoft.com/office/2006/metadata/properties" xmlns:xsi="http://www.w3.org/2001/XMLSchema-instance" xmlns:pc="http://schemas.microsoft.com/office/infopath/2007/PartnerControls">
-  <documentManagement>
-    <lcf76f155ced4ddcb4097134ff3c332f xmlns="515ea0e1-5a02-4250-9635-37357dff5b95">
-      <Terms xmlns="http://schemas.microsoft.com/office/infopath/2007/PartnerControls"/>
-    </lcf76f155ced4ddcb4097134ff3c332f>
-    <TaxCatchAll xmlns="872d6353-9dfb-4ea1-9213-a876be8aa8ec" xsi:nil="true"/>
-  </documentManagement>
-</p:properties>
-</file>
-
-<file path=customXml/item3.xml><?xml version="1.0" encoding="utf-8"?>
-<b:Sources xmlns:b="http://schemas.openxmlformats.org/officeDocument/2006/bibliography" xmlns="http://schemas.openxmlformats.org/officeDocument/2006/bibliography" SelectedStyle="\APASixthEditionOfficeOnline.xsl" StyleName="APA" Version="6"/>
-</file>
-
-<file path=customXml/item4.xml><?xml version="1.0" encoding="utf-8"?>
 <ct:contentTypeSchema xmlns:ct="http://schemas.microsoft.com/office/2006/metadata/contentType" xmlns:ma="http://schemas.microsoft.com/office/2006/metadata/properties/metaAttributes" ct:_="" ma:_="" ma:contentTypeName="Document" ma:contentTypeID="0x0101005559178AD32BD04EBA7D8A91CE53EFFB" ma:contentTypeVersion="19" ma:contentTypeDescription="Create a new document." ma:contentTypeScope="" ma:versionID="c82bfb622c7bcee270cdceabe46e216e">
   <xsd:schema xmlns:xsd="http://www.w3.org/2001/XMLSchema" xmlns:xs="http://www.w3.org/2001/XMLSchema" xmlns:p="http://schemas.microsoft.com/office/2006/metadata/properties" xmlns:ns2="872d6353-9dfb-4ea1-9213-a876be8aa8ec" xmlns:ns3="515ea0e1-5a02-4250-9635-37357dff5b95" targetNamespace="http://schemas.microsoft.com/office/2006/metadata/properties" ma:root="true" ma:fieldsID="93ef0505dc50297050134d92fca93912" ns2:_="" ns3:_="">
     <xsd:import namespace="872d6353-9dfb-4ea1-9213-a876be8aa8ec"/>
@@ -7387,34 +6910,31 @@
 </ct:contentTypeSchema>
 </file>
 
-<file path=customXml/itemProps1.xml><?xml version="1.0" encoding="utf-8"?>
-<ds:datastoreItem xmlns:ds="http://schemas.openxmlformats.org/officeDocument/2006/customXml" ds:itemID="{8ABC9BAE-B932-41FA-92EF-DECC63E3849C}">
-  <ds:schemaRefs>
-    <ds:schemaRef ds:uri="http://schemas.microsoft.com/sharepoint/v3/contenttype/forms"/>
-  </ds:schemaRefs>
-</ds:datastoreItem>
+<file path=customXml/item2.xml><?xml version="1.0" encoding="utf-8"?>
+<b:Sources xmlns:b="http://schemas.openxmlformats.org/officeDocument/2006/bibliography" xmlns="http://schemas.openxmlformats.org/officeDocument/2006/bibliography" SelectedStyle="\APASixthEditionOfficeOnline.xsl" StyleName="APA" Version="6"/>
 </file>
 
-<file path=customXml/itemProps2.xml><?xml version="1.0" encoding="utf-8"?>
-<ds:datastoreItem xmlns:ds="http://schemas.openxmlformats.org/officeDocument/2006/customXml" ds:itemID="{932AFDBE-0F3C-4BD9-82A2-23E8BC56046A}">
-  <ds:schemaRefs>
-    <ds:schemaRef ds:uri="http://schemas.microsoft.com/office/2006/metadata/properties"/>
-    <ds:schemaRef ds:uri="http://schemas.microsoft.com/office/infopath/2007/PartnerControls"/>
-    <ds:schemaRef ds:uri="515ea0e1-5a02-4250-9635-37357dff5b95"/>
-    <ds:schemaRef ds:uri="872d6353-9dfb-4ea1-9213-a876be8aa8ec"/>
-  </ds:schemaRefs>
-</ds:datastoreItem>
+<file path=customXml/item3.xml><?xml version="1.0" encoding="utf-8"?>
+<p:properties xmlns:p="http://schemas.microsoft.com/office/2006/metadata/properties" xmlns:xsi="http://www.w3.org/2001/XMLSchema-instance" xmlns:pc="http://schemas.microsoft.com/office/infopath/2007/PartnerControls">
+  <documentManagement>
+    <lcf76f155ced4ddcb4097134ff3c332f xmlns="515ea0e1-5a02-4250-9635-37357dff5b95">
+      <Terms xmlns="http://schemas.microsoft.com/office/infopath/2007/PartnerControls"/>
+    </lcf76f155ced4ddcb4097134ff3c332f>
+    <TaxCatchAll xmlns="872d6353-9dfb-4ea1-9213-a876be8aa8ec" xsi:nil="true"/>
+  </documentManagement>
+</p:properties>
 </file>
 
-<file path=customXml/itemProps3.xml><?xml version="1.0" encoding="utf-8"?>
-<ds:datastoreItem xmlns:ds="http://schemas.openxmlformats.org/officeDocument/2006/customXml" ds:itemID="{CB6BC05A-FB64-4BFF-9A44-1F50B23ECEBF}">
-  <ds:schemaRefs>
-    <ds:schemaRef ds:uri="http://schemas.openxmlformats.org/officeDocument/2006/bibliography"/>
-  </ds:schemaRefs>
-</ds:datastoreItem>
+<file path=customXml/item4.xml><?xml version="1.0" encoding="utf-8"?>
+<?mso-contentType ?>
+<FormTemplates xmlns="http://schemas.microsoft.com/sharepoint/v3/contenttype/forms">
+  <Display>DocumentLibraryForm</Display>
+  <Edit>DocumentLibraryForm</Edit>
+  <New>DocumentLibraryForm</New>
+</FormTemplates>
 </file>
 
-<file path=customXml/itemProps4.xml><?xml version="1.0" encoding="utf-8"?>
+<file path=customXml/itemProps1.xml><?xml version="1.0" encoding="utf-8"?>
 <ds:datastoreItem xmlns:ds="http://schemas.openxmlformats.org/officeDocument/2006/customXml" ds:itemID="{2D8D4289-114A-4782-A247-DFC332083B9B}">
   <ds:schemaRefs>
     <ds:schemaRef ds:uri="http://schemas.microsoft.com/office/2006/metadata/contentType"/>
@@ -7431,4 +6951,31 @@
     <ds:schemaRef ds:uri="http://schemas.microsoft.com/internal/obd"/>
   </ds:schemaRefs>
 </ds:datastoreItem>
+</file>
+
+<file path=customXml/itemProps2.xml><?xml version="1.0" encoding="utf-8"?>
+<ds:datastoreItem xmlns:ds="http://schemas.openxmlformats.org/officeDocument/2006/customXml" ds:itemID="{CB6BC05A-FB64-4BFF-9A44-1F50B23ECEBF}">
+  <ds:schemaRefs>
+    <ds:schemaRef ds:uri="http://schemas.openxmlformats.org/officeDocument/2006/bibliography"/>
+  </ds:schemaRefs>
+</ds:datastoreItem>
+</file>
+
+<file path=customXml/itemProps3.xml><?xml version="1.0" encoding="utf-8"?>
+<ds:datastoreItem xmlns:ds="http://schemas.openxmlformats.org/officeDocument/2006/customXml" ds:itemID="{932AFDBE-0F3C-4BD9-82A2-23E8BC56046A}">
+  <ds:schemaRefs>
+    <ds:schemaRef ds:uri="http://schemas.microsoft.com/office/2006/metadata/properties"/>
+    <ds:schemaRef ds:uri="http://schemas.microsoft.com/office/infopath/2007/PartnerControls"/>
+    <ds:schemaRef ds:uri="515ea0e1-5a02-4250-9635-37357dff5b95"/>
+    <ds:schemaRef ds:uri="872d6353-9dfb-4ea1-9213-a876be8aa8ec"/>
+  </ds:schemaRefs>
+</ds:datastoreItem>
+</file>
+
+<file path=customXml/itemProps4.xml><?xml version="1.0" encoding="utf-8"?>
+<ds:datastoreItem xmlns:ds="http://schemas.openxmlformats.org/officeDocument/2006/customXml" ds:itemID="{8ABC9BAE-B932-41FA-92EF-DECC63E3849C}">
+  <ds:schemaRefs>
+    <ds:schemaRef ds:uri="http://schemas.microsoft.com/sharepoint/v3/contenttype/forms"/>
+  </ds:schemaRefs>
+</ds:datastoreItem>
 </file>
</xml_diff>